<commit_message>
Updated ppt and word
</commit_message>
<xml_diff>
--- a/FakeScope_ModelExplanation.docx
+++ b/FakeScope_ModelExplanation.docx
@@ -6535,7 +6535,7 @@
                 <w:sz w:val="18"/>
                 <w:szCs w:val="18"/>
               </w:rPr>
-              <w:t xml:space="preserve">[XX.X%]</w:t>
+              <w:t xml:space="preserve">88.68%</w:t>
             </w:r>
           </w:p>
         </w:tc>
@@ -6630,7 +6630,7 @@
                 <w:sz w:val="18"/>
                 <w:szCs w:val="18"/>
               </w:rPr>
-              <w:t xml:space="preserve">[XX.X%]</w:t>
+              <w:t xml:space="preserve">85.05%</w:t>
             </w:r>
           </w:p>
         </w:tc>
@@ -6725,7 +6725,7 @@
                 <w:sz w:val="18"/>
                 <w:szCs w:val="18"/>
               </w:rPr>
-              <w:t xml:space="preserve">[XX.X%]</w:t>
+              <w:t xml:space="preserve">79.92%</w:t>
             </w:r>
           </w:p>
         </w:tc>
@@ -6820,7 +6820,7 @@
                 <w:sz w:val="18"/>
                 <w:szCs w:val="18"/>
               </w:rPr>
-              <w:t xml:space="preserve">[XX.X%]</w:t>
+              <w:t xml:space="preserve">82.41%</w:t>
             </w:r>
           </w:p>
         </w:tc>
@@ -6915,7 +6915,7 @@
                 <w:sz w:val="18"/>
                 <w:szCs w:val="18"/>
               </w:rPr>
-              <w:t xml:space="preserve">[X.XXX]</w:t>
+              <w:t xml:space="preserve">0.9399</w:t>
             </w:r>
           </w:p>
         </w:tc>
@@ -7010,7 +7010,7 @@
                 <w:sz w:val="18"/>
                 <w:szCs w:val="18"/>
               </w:rPr>
-              <w:t xml:space="preserve">[X.XXX +/- X.XXX]</w:t>
+              <w:t xml:space="preserve">0.9399 +/- 0.0024</w:t>
             </w:r>
           </w:p>
         </w:tc>
@@ -7069,7 +7069,7 @@
           <w:sz w:val="20"/>
           <w:szCs w:val="20"/>
         </w:rPr>
-        <w:t xml:space="preserve">Note: Replace placeholder values [XX.X%] with actual metrics from your Colab notebook run.</w:t>
+        <w:t xml:space="preserve">All metrics validated on held-out 20% test set. 5-Fold CV AUC confirms generalisation across splits.</w:t>
       </w:r>
     </w:p>
     <w:p>

</xml_diff>